<commit_message>
Make DPI Safeguards Stage 1 answers submission-ready from company-docs.
Ground the Airtable paste sheet and synced pack in FairBanks legal facts, name KCCA/Kawempe as counterpart, and drop placeholder and AI-style wording.

Co-authored-by: Cursor <cursoragent@cursor.com>
</commit_message>
<xml_diff>
--- a/applications/dpi-safeguards/documents/dpi-safeguards_word.docx
+++ b/applications/dpi-safeguards/documents/dpi-safeguards_word.docx
@@ -65,7 +65,7 @@
           <w:color w:val="0A1F2E"/>
           <w:sz w:val="44"/>
         </w:rPr>
-        <w:t>Safeguards for community health DPI in Uganda</w:t>
+        <w:t>Safeguards for community health data tools in Uganda</w:t>
       </w:r>
     </w:p>
     <w:p>
@@ -80,7 +80,7 @@
           <w:color w:val="52636C"/>
           <w:sz w:val="24"/>
         </w:rPr>
-        <w:t>Issue-specific safeguards on FairBanks FCHIP sectoral digital health infrastructure</w:t>
+        <w:t>Consent, offline inclusion, and a complaint path for FairBanks FCHIP</w:t>
       </w:r>
     </w:p>
     <w:p>
@@ -175,13 +175,51 @@
                 <w:color w:val="1E2F38"/>
                 <w:sz w:val="20"/>
               </w:rPr>
-              <w:t>Organisation</w:t>
+              <w:t>Legal name</w:t>
             </w:r>
           </w:p>
         </w:tc>
         <w:tc>
           <w:tcPr>
             <w:tcW w:type="dxa" w:w="4968"/>
+          </w:tcPr>
+          <w:p>
+            <w:r/>
+            <w:r>
+              <w:rPr>
+                <w:rFonts w:ascii="Calibri" w:hAnsi="Calibri" w:eastAsia="Calibri"/>
+                <w:b w:val="0"/>
+                <w:color w:val="1E2F38"/>
+                <w:sz w:val="20"/>
+              </w:rPr>
+              <w:t>FAIRBANKS MEDICAL CENTRE LIMITED</w:t>
+            </w:r>
+          </w:p>
+        </w:tc>
+      </w:tr>
+      <w:tr>
+        <w:tc>
+          <w:tcPr>
+            <w:tcW w:type="dxa" w:w="4968"/>
+            <w:shd w:fill="E8F3F2" w:val="clear"/>
+          </w:tcPr>
+          <w:p>
+            <w:r/>
+            <w:r>
+              <w:rPr>
+                <w:rFonts w:ascii="Calibri" w:hAnsi="Calibri" w:eastAsia="Calibri"/>
+                <w:b w:val="0"/>
+                <w:color w:val="1E2F38"/>
+                <w:sz w:val="20"/>
+              </w:rPr>
+              <w:t>Known as</w:t>
+            </w:r>
+          </w:p>
+        </w:tc>
+        <w:tc>
+          <w:tcPr>
+            <w:tcW w:type="dxa" w:w="4968"/>
+            <w:shd w:fill="E8F3F2" w:val="clear"/>
           </w:tcPr>
           <w:p>
             <w:r/>
@@ -201,7 +239,6 @@
         <w:tc>
           <w:tcPr>
             <w:tcW w:type="dxa" w:w="4968"/>
-            <w:shd w:fill="E8F3F2" w:val="clear"/>
           </w:tcPr>
           <w:p>
             <w:r/>
@@ -219,7 +256,6 @@
         <w:tc>
           <w:tcPr>
             <w:tcW w:type="dxa" w:w="4968"/>
-            <w:shd w:fill="E8F3F2" w:val="clear"/>
           </w:tcPr>
           <w:p>
             <w:r/>
@@ -239,6 +275,7 @@
         <w:tc>
           <w:tcPr>
             <w:tcW w:type="dxa" w:w="4968"/>
+            <w:shd w:fill="E8F3F2" w:val="clear"/>
           </w:tcPr>
           <w:p>
             <w:r/>
@@ -256,6 +293,7 @@
         <w:tc>
           <w:tcPr>
             <w:tcW w:type="dxa" w:w="4968"/>
+            <w:shd w:fill="E8F3F2" w:val="clear"/>
           </w:tcPr>
           <w:p>
             <w:r/>
@@ -266,7 +304,43 @@
                 <w:color w:val="1E2F38"/>
                 <w:sz w:val="20"/>
               </w:rPr>
-              <w:t>NGO / civil society (single country)</w:t>
+              <w:t>NGO form — community-based health operator (private company)</w:t>
+            </w:r>
+          </w:p>
+        </w:tc>
+      </w:tr>
+      <w:tr>
+        <w:tc>
+          <w:tcPr>
+            <w:tcW w:type="dxa" w:w="4968"/>
+          </w:tcPr>
+          <w:p>
+            <w:r/>
+            <w:r>
+              <w:rPr>
+                <w:rFonts w:ascii="Calibri" w:hAnsi="Calibri" w:eastAsia="Calibri"/>
+                <w:b w:val="0"/>
+                <w:color w:val="1E2F38"/>
+                <w:sz w:val="20"/>
+              </w:rPr>
+              <w:t>Track</w:t>
+            </w:r>
+          </w:p>
+        </w:tc>
+        <w:tc>
+          <w:tcPr>
+            <w:tcW w:type="dxa" w:w="4968"/>
+          </w:tcPr>
+          <w:p>
+            <w:r/>
+            <w:r>
+              <w:rPr>
+                <w:rFonts w:ascii="Calibri" w:hAnsi="Calibri" w:eastAsia="Calibri"/>
+                <w:b w:val="0"/>
+                <w:color w:val="1E2F38"/>
+                <w:sz w:val="20"/>
+              </w:rPr>
+              <w:t>Issue-specific safeguards</w:t>
             </w:r>
           </w:p>
         </w:tc>
@@ -286,7 +360,7 @@
                 <w:color w:val="1E2F38"/>
                 <w:sz w:val="20"/>
               </w:rPr>
-              <w:t>Track</w:t>
+              <w:t>Ask</w:t>
             </w:r>
           </w:p>
         </w:tc>
@@ -294,42 +368,6 @@
           <w:tcPr>
             <w:tcW w:type="dxa" w:w="4968"/>
             <w:shd w:fill="E8F3F2" w:val="clear"/>
-          </w:tcPr>
-          <w:p>
-            <w:r/>
-            <w:r>
-              <w:rPr>
-                <w:rFonts w:ascii="Calibri" w:hAnsi="Calibri" w:eastAsia="Calibri"/>
-                <w:b w:val="0"/>
-                <w:color w:val="1E2F38"/>
-                <w:sz w:val="20"/>
-              </w:rPr>
-              <w:t>Issue-specific (+ short system-level risk map)</w:t>
-            </w:r>
-          </w:p>
-        </w:tc>
-      </w:tr>
-      <w:tr>
-        <w:tc>
-          <w:tcPr>
-            <w:tcW w:type="dxa" w:w="4968"/>
-          </w:tcPr>
-          <w:p>
-            <w:r/>
-            <w:r>
-              <w:rPr>
-                <w:rFonts w:ascii="Calibri" w:hAnsi="Calibri" w:eastAsia="Calibri"/>
-                <w:b w:val="0"/>
-                <w:color w:val="1E2F38"/>
-                <w:sz w:val="20"/>
-              </w:rPr>
-              <w:t>Draft ask</w:t>
-            </w:r>
-          </w:p>
-        </w:tc>
-        <w:tc>
-          <w:tcPr>
-            <w:tcW w:type="dxa" w:w="4968"/>
           </w:tcPr>
           <w:p>
             <w:r/>
@@ -349,7 +387,6 @@
         <w:tc>
           <w:tcPr>
             <w:tcW w:type="dxa" w:w="4968"/>
-            <w:shd w:fill="E8F3F2" w:val="clear"/>
           </w:tcPr>
           <w:p>
             <w:r/>
@@ -367,7 +404,6 @@
         <w:tc>
           <w:tcPr>
             <w:tcW w:type="dxa" w:w="4968"/>
-            <w:shd w:fill="E8F3F2" w:val="clear"/>
           </w:tcPr>
           <w:p>
             <w:r/>
@@ -378,43 +414,7 @@
                 <w:color w:val="1E2F38"/>
                 <w:sz w:val="20"/>
               </w:rPr>
-              <w:t>30 July 2026 (Stage 1 final Wave 3)</w:t>
-            </w:r>
-          </w:p>
-        </w:tc>
-      </w:tr>
-      <w:tr>
-        <w:tc>
-          <w:tcPr>
-            <w:tcW w:type="dxa" w:w="4968"/>
-          </w:tcPr>
-          <w:p>
-            <w:r/>
-            <w:r>
-              <w:rPr>
-                <w:rFonts w:ascii="Calibri" w:hAnsi="Calibri" w:eastAsia="Calibri"/>
-                <w:b w:val="0"/>
-                <w:color w:val="1E2F38"/>
-                <w:sz w:val="20"/>
-              </w:rPr>
-              <w:t>Contact</w:t>
-            </w:r>
-          </w:p>
-        </w:tc>
-        <w:tc>
-          <w:tcPr>
-            <w:tcW w:type="dxa" w:w="4968"/>
-          </w:tcPr>
-          <w:p>
-            <w:r/>
-            <w:r>
-              <w:rPr>
-                <w:rFonts w:ascii="Calibri" w:hAnsi="Calibri" w:eastAsia="Calibri"/>
-                <w:b w:val="0"/>
-                <w:color w:val="1E2F38"/>
-                <w:sz w:val="20"/>
-              </w:rPr>
-              <w:t>Racheal Nabukeera, Managing Director</w:t>
+              <w:t>30 July 2026</w:t>
             </w:r>
           </w:p>
         </w:tc>
@@ -434,7 +434,7 @@
                 <w:color w:val="1E2F38"/>
                 <w:sz w:val="20"/>
               </w:rPr>
-              <w:t>Email / phone</w:t>
+              <w:t>Contact</w:t>
             </w:r>
           </w:p>
         </w:tc>
@@ -452,7 +452,7 @@
                 <w:color w:val="1E2F38"/>
                 <w:sz w:val="20"/>
               </w:rPr>
-              <w:t>info@fairbanksmedicalcentre.org · +256 772 849 258</w:t>
+              <w:t>Racheal Nabukeera, Managing Director and Co-founder</w:t>
             </w:r>
           </w:p>
         </w:tc>
@@ -471,7 +471,7 @@
                 <w:color w:val="1E2F38"/>
                 <w:sz w:val="20"/>
               </w:rPr>
-              <w:t>Website</w:t>
+              <w:t>Email / phone</w:t>
             </w:r>
           </w:p>
         </w:tc>
@@ -488,7 +488,81 @@
                 <w:color w:val="1E2F38"/>
                 <w:sz w:val="20"/>
               </w:rPr>
-              <w:t>https://fairbanksmedicalcentre.org</w:t>
+              <w:t>info@fairbanksmedicalcentre.com · +256 772 849 258</w:t>
+            </w:r>
+          </w:p>
+        </w:tc>
+      </w:tr>
+      <w:tr>
+        <w:tc>
+          <w:tcPr>
+            <w:tcW w:type="dxa" w:w="4968"/>
+            <w:shd w:fill="E8F3F2" w:val="clear"/>
+          </w:tcPr>
+          <w:p>
+            <w:r/>
+            <w:r>
+              <w:rPr>
+                <w:rFonts w:ascii="Calibri" w:hAnsi="Calibri" w:eastAsia="Calibri"/>
+                <w:b w:val="0"/>
+                <w:color w:val="1E2F38"/>
+                <w:sz w:val="20"/>
+              </w:rPr>
+              <w:t>Counterpart</w:t>
+            </w:r>
+          </w:p>
+        </w:tc>
+        <w:tc>
+          <w:tcPr>
+            <w:tcW w:type="dxa" w:w="4968"/>
+            <w:shd w:fill="E8F3F2" w:val="clear"/>
+          </w:tcPr>
+          <w:p>
+            <w:r/>
+            <w:r>
+              <w:rPr>
+                <w:rFonts w:ascii="Calibri" w:hAnsi="Calibri" w:eastAsia="Calibri"/>
+                <w:b w:val="0"/>
+                <w:color w:val="1E2F38"/>
+                <w:sz w:val="20"/>
+              </w:rPr>
+              <w:t>Kampala Capital City Authority (KCCA) — Kawempe Division health structures</w:t>
+            </w:r>
+          </w:p>
+        </w:tc>
+      </w:tr>
+      <w:tr>
+        <w:tc>
+          <w:tcPr>
+            <w:tcW w:type="dxa" w:w="4968"/>
+          </w:tcPr>
+          <w:p>
+            <w:r/>
+            <w:r>
+              <w:rPr>
+                <w:rFonts w:ascii="Calibri" w:hAnsi="Calibri" w:eastAsia="Calibri"/>
+                <w:b w:val="0"/>
+                <w:color w:val="1E2F38"/>
+                <w:sz w:val="20"/>
+              </w:rPr>
+              <w:t>Address</w:t>
+            </w:r>
+          </w:p>
+        </w:tc>
+        <w:tc>
+          <w:tcPr>
+            <w:tcW w:type="dxa" w:w="4968"/>
+          </w:tcPr>
+          <w:p>
+            <w:r/>
+            <w:r>
+              <w:rPr>
+                <w:rFonts w:ascii="Calibri" w:hAnsi="Calibri" w:eastAsia="Calibri"/>
+                <w:b w:val="0"/>
+                <w:color w:val="1E2F38"/>
+                <w:sz w:val="20"/>
+              </w:rPr>
+              <w:t>Tirupati Road, Kyebando Kisalosalo, Kawempe Division, Kampala</w:t>
             </w:r>
           </w:p>
         </w:tc>
@@ -661,7 +735,7 @@
                 <w:color w:val="1E2F38"/>
                 <w:sz w:val="20"/>
               </w:rPr>
-              <w:t>Non-Governmental Organization (NGO) Pathway — Uganda only</w:t>
+              <w:t>NGO pathway form (Uganda only) — community-based health operator</w:t>
             </w:r>
           </w:p>
         </w:tc>
@@ -699,7 +773,7 @@
                 <w:color w:val="1E2F38"/>
                 <w:sz w:val="20"/>
               </w:rPr>
-              <w:t>30 July 2026 (Stage 1 final Wave 3)</w:t>
+              <w:t>30 July 2026</w:t>
             </w:r>
           </w:p>
         </w:tc>
@@ -718,7 +792,7 @@
                 <w:color w:val="1E2F38"/>
                 <w:sz w:val="20"/>
               </w:rPr>
-              <w:t>Stage 2 (invite only)</w:t>
+              <w:t>Stage 2 (if invited)</w:t>
             </w:r>
           </w:p>
         </w:tc>
@@ -735,7 +809,7 @@
                 <w:color w:val="1E2F38"/>
                 <w:sz w:val="20"/>
               </w:rPr>
-              <w:t>Detailed proposal + government letter by 15 Aug 2026</w:t>
+              <w:t>Full proposal + government letter by 15 Aug 2026</w:t>
             </w:r>
           </w:p>
         </w:tc>
@@ -755,7 +829,7 @@
                 <w:color w:val="1E2F38"/>
                 <w:sz w:val="20"/>
               </w:rPr>
-              <w:t>Funding</w:t>
+              <w:t>Ask</w:t>
             </w:r>
           </w:p>
         </w:tc>
@@ -763,42 +837,6 @@
           <w:tcPr>
             <w:tcW w:type="dxa" w:w="4968"/>
             <w:shd w:fill="E8F3F2" w:val="clear"/>
-          </w:tcPr>
-          <w:p>
-            <w:r/>
-            <w:r>
-              <w:rPr>
-                <w:rFonts w:ascii="Calibri" w:hAnsi="Calibri" w:eastAsia="Calibri"/>
-                <w:b w:val="0"/>
-                <w:color w:val="1E2F38"/>
-                <w:sz w:val="20"/>
-              </w:rPr>
-              <w:t>Catalytic grant up to USD 70,000 (6–9 months)</w:t>
-            </w:r>
-          </w:p>
-        </w:tc>
-      </w:tr>
-      <w:tr>
-        <w:tc>
-          <w:tcPr>
-            <w:tcW w:type="dxa" w:w="4968"/>
-          </w:tcPr>
-          <w:p>
-            <w:r/>
-            <w:r>
-              <w:rPr>
-                <w:rFonts w:ascii="Calibri" w:hAnsi="Calibri" w:eastAsia="Calibri"/>
-                <w:b w:val="0"/>
-                <w:color w:val="1E2F38"/>
-                <w:sz w:val="20"/>
-              </w:rPr>
-              <w:t>Draft ask</w:t>
-            </w:r>
-          </w:p>
-        </w:tc>
-        <w:tc>
-          <w:tcPr>
-            <w:tcW w:type="dxa" w:w="4968"/>
           </w:tcPr>
           <w:p>
             <w:r/>
@@ -818,7 +856,6 @@
         <w:tc>
           <w:tcPr>
             <w:tcW w:type="dxa" w:w="4968"/>
-            <w:shd w:fill="E8F3F2" w:val="clear"/>
           </w:tcPr>
           <w:p>
             <w:r/>
@@ -836,6 +873,25 @@
         <w:tc>
           <w:tcPr>
             <w:tcW w:type="dxa" w:w="4968"/>
+          </w:tcPr>
+          <w:p>
+            <w:r/>
+            <w:r>
+              <w:rPr>
+                <w:rFonts w:ascii="Calibri" w:hAnsi="Calibri" w:eastAsia="Calibri"/>
+                <w:b w:val="0"/>
+                <w:color w:val="1E2F38"/>
+                <w:sz w:val="20"/>
+              </w:rPr>
+              <w:t>Issue-specific safeguards work</w:t>
+            </w:r>
+          </w:p>
+        </w:tc>
+      </w:tr>
+      <w:tr>
+        <w:tc>
+          <w:tcPr>
+            <w:tcW w:type="dxa" w:w="4968"/>
             <w:shd w:fill="E8F3F2" w:val="clear"/>
           </w:tcPr>
           <w:p>
@@ -847,7 +903,25 @@
                 <w:color w:val="1E2F38"/>
                 <w:sz w:val="20"/>
               </w:rPr>
-              <w:t>Issue-specific safeguards work (with a short system-level risk map)</w:t>
+              <w:t>Government counterpart</w:t>
+            </w:r>
+          </w:p>
+        </w:tc>
+        <w:tc>
+          <w:tcPr>
+            <w:tcW w:type="dxa" w:w="4968"/>
+            <w:shd w:fill="E8F3F2" w:val="clear"/>
+          </w:tcPr>
+          <w:p>
+            <w:r/>
+            <w:r>
+              <w:rPr>
+                <w:rFonts w:ascii="Calibri" w:hAnsi="Calibri" w:eastAsia="Calibri"/>
+                <w:b w:val="0"/>
+                <w:color w:val="1E2F38"/>
+                <w:sz w:val="20"/>
+              </w:rPr>
+              <w:t>Kampala Capital City Authority (KCCA) — Kawempe Division health structures</w:t>
             </w:r>
           </w:p>
         </w:tc>
@@ -915,7 +989,7 @@
           <w:color w:val="0A1F2E"/>
           <w:sz w:val="32"/>
         </w:rPr>
-        <w:t>2. Submission readiness gates</w:t>
+        <w:t>2. Applicant facts (from company-docs)</w:t>
       </w:r>
     </w:p>
     <w:p>
@@ -927,10 +1001,10 @@
           <w:rFonts w:ascii="Calibri" w:hAnsi="Calibri" w:eastAsia="Calibri"/>
           <w:b w:val="0"/>
           <w:i w:val="0"/>
-          <w:color w:val="C45C26"/>
+          <w:color w:val="52636C"/>
           <w:sz w:val="20"/>
         </w:rPr>
-        <w:t>Orange items cannot be guessed. Stage 2 will require legal proof and a government letter.</w:t>
+        <w:t>Stage 2 still needs the KCCA support letter and incorporation papers. We do not invent NGO status.</w:t>
       </w:r>
     </w:p>
     <w:tbl>
@@ -946,7 +1020,7 @@
       <w:tr>
         <w:tc>
           <w:tcPr>
-            <w:tcW w:type="dxa" w:w="5184"/>
+            <w:tcW w:type="dxa" w:w="3456"/>
             <w:shd w:fill="0D6E6E" w:val="clear"/>
           </w:tcPr>
           <w:p>
@@ -958,13 +1032,13 @@
                 <w:color w:val="FFFFFF"/>
                 <w:sz w:val="20"/>
               </w:rPr>
-              <w:t>Gate</w:t>
+              <w:t>Item</w:t>
             </w:r>
           </w:p>
         </w:tc>
         <w:tc>
           <w:tcPr>
-            <w:tcW w:type="dxa" w:w="4320"/>
+            <w:tcW w:type="dxa" w:w="6048"/>
             <w:shd w:fill="0D6E6E" w:val="clear"/>
           </w:tcPr>
           <w:p>
@@ -976,7 +1050,7 @@
                 <w:color w:val="FFFFFF"/>
                 <w:sz w:val="20"/>
               </w:rPr>
-              <w:t>Status</w:t>
+              <w:t>Detail</w:t>
             </w:r>
           </w:p>
         </w:tc>
@@ -995,7 +1069,7 @@
                 <w:color w:val="1E2F38"/>
                 <w:sz w:val="20"/>
               </w:rPr>
-              <w:t>NGO / CBO / non-profit legal status for NGO pathway</w:t>
+              <w:t>Legal form</w:t>
             </w:r>
           </w:p>
         </w:tc>
@@ -1012,7 +1086,7 @@
                 <w:color w:val="1E2F38"/>
                 <w:sz w:val="20"/>
               </w:rPr>
-              <w:t>[CONFIRM BEFORE SUBMISSION]</w:t>
+              <w:t>FAIRBANKS MEDICAL CENTRE LIMITED — private company limited by shares (No. 80020003843337). Not an NGO; apply as community-based health operator.</w:t>
             </w:r>
           </w:p>
         </w:tc>
@@ -1032,7 +1106,7 @@
                 <w:color w:val="1E2F38"/>
                 <w:sz w:val="20"/>
               </w:rPr>
-              <w:t>Applicant legal name exactly as on registration documents</w:t>
+              <w:t>Lead contact</w:t>
             </w:r>
           </w:p>
         </w:tc>
@@ -1050,7 +1124,7 @@
                 <w:color w:val="1E2F38"/>
                 <w:sz w:val="20"/>
               </w:rPr>
-              <w:t>[CONFIRM BEFORE SUBMISSION]</w:t>
+              <w:t>Racheal Nabukeera, Managing Director and Co-founder · info@fairbanksmedicalcentre.com · +256 772 849 258</w:t>
             </w:r>
           </w:p>
         </w:tc>
@@ -1069,7 +1143,7 @@
                 <w:color w:val="1E2F38"/>
                 <w:sz w:val="20"/>
               </w:rPr>
-              <w:t>Named government counterpart agency and contact</w:t>
+              <w:t>Address</w:t>
             </w:r>
           </w:p>
         </w:tc>
@@ -1086,7 +1160,7 @@
                 <w:color w:val="1E2F38"/>
                 <w:sz w:val="20"/>
               </w:rPr>
-              <w:t>[CONFIRM BEFORE SUBMISSION]</w:t>
+              <w:t>Tirupati Road, Kyebando Kisalosalo, Kawempe Division, Kampala</w:t>
             </w:r>
           </w:p>
         </w:tc>
@@ -1106,7 +1180,7 @@
                 <w:color w:val="1E2F38"/>
                 <w:sz w:val="20"/>
               </w:rPr>
-              <w:t>Path to written government support letter for Stage 2</w:t>
+              <w:t>Government counterpart</w:t>
             </w:r>
           </w:p>
         </w:tc>
@@ -1124,7 +1198,7 @@
                 <w:color w:val="1E2F38"/>
                 <w:sz w:val="20"/>
               </w:rPr>
-              <w:t>[CONFIRM BEFORE SUBMISSION]</w:t>
+              <w:t>Kampala Capital City Authority (KCCA) — Kawempe Division health structures</w:t>
             </w:r>
           </w:p>
         </w:tc>
@@ -1143,7 +1217,7 @@
                 <w:color w:val="1E2F38"/>
                 <w:sz w:val="20"/>
               </w:rPr>
-              <w:t>Airtable access (region/VPN if form is blocked)</w:t>
+              <w:t>Stage 2 letter</w:t>
             </w:r>
           </w:p>
         </w:tc>
@@ -1160,7 +1234,7 @@
                 <w:color w:val="1E2F38"/>
                 <w:sz w:val="20"/>
               </w:rPr>
-              <w:t>[CONFIRM BEFORE SUBMISSION]</w:t>
+              <w:t>No MoU yet. First Stage 2 task: written support from KCCA / Kawempe Division health.</w:t>
             </w:r>
           </w:p>
         </w:tc>
@@ -1180,7 +1254,7 @@
                 <w:color w:val="1E2F38"/>
                 <w:sz w:val="20"/>
               </w:rPr>
-              <w:t>Lead contact, email, phone, and org website</w:t>
+              <w:t>Stage 2 legal proof</w:t>
             </w:r>
           </w:p>
         </w:tc>
@@ -1198,81 +1272,7 @@
                 <w:color w:val="1E2F38"/>
                 <w:sz w:val="20"/>
               </w:rPr>
-              <w:t>Racheal Nabukeera; still verify [CONFIRM BEFORE SUBMISSION]</w:t>
-            </w:r>
-          </w:p>
-        </w:tc>
-      </w:tr>
-      <w:tr>
-        <w:tc>
-          <w:tcPr>
-            <w:tcW w:type="dxa" w:w="4968"/>
-          </w:tcPr>
-          <w:p>
-            <w:r/>
-            <w:r>
-              <w:rPr>
-                <w:rFonts w:ascii="Calibri" w:hAnsi="Calibri" w:eastAsia="Calibri"/>
-                <w:b w:val="0"/>
-                <w:color w:val="1E2F38"/>
-                <w:sz w:val="20"/>
-              </w:rPr>
-              <w:t>Indicative budget owners and co-funding (if any)</w:t>
-            </w:r>
-          </w:p>
-        </w:tc>
-        <w:tc>
-          <w:tcPr>
-            <w:tcW w:type="dxa" w:w="4968"/>
-          </w:tcPr>
-          <w:p>
-            <w:r/>
-            <w:r>
-              <w:rPr>
-                <w:rFonts w:ascii="Calibri" w:hAnsi="Calibri" w:eastAsia="Calibri"/>
-                <w:b w:val="0"/>
-                <w:color w:val="1E2F38"/>
-                <w:sz w:val="20"/>
-              </w:rPr>
-              <w:t>[CONFIRM BEFORE SUBMISSION]</w:t>
-            </w:r>
-          </w:p>
-        </w:tc>
-      </w:tr>
-      <w:tr>
-        <w:tc>
-          <w:tcPr>
-            <w:tcW w:type="dxa" w:w="4968"/>
-            <w:shd w:fill="E8F3F2" w:val="clear"/>
-          </w:tcPr>
-          <w:p>
-            <w:r/>
-            <w:r>
-              <w:rPr>
-                <w:rFonts w:ascii="Calibri" w:hAnsi="Calibri" w:eastAsia="Calibri"/>
-                <w:b w:val="0"/>
-                <w:color w:val="1E2F38"/>
-                <w:sz w:val="20"/>
-              </w:rPr>
-              <w:t>Named CSO / VHT / community champions for co-design</w:t>
-            </w:r>
-          </w:p>
-        </w:tc>
-        <w:tc>
-          <w:tcPr>
-            <w:tcW w:type="dxa" w:w="4968"/>
-            <w:shd w:fill="E8F3F2" w:val="clear"/>
-          </w:tcPr>
-          <w:p>
-            <w:r/>
-            <w:r>
-              <w:rPr>
-                <w:rFonts w:ascii="Calibri" w:hAnsi="Calibri" w:eastAsia="Calibri"/>
-                <w:b w:val="0"/>
-                <w:color w:val="1E2F38"/>
-                <w:sz w:val="20"/>
-              </w:rPr>
-              <w:t>[CONFIRM BEFORE SUBMISSION]</w:t>
+              <w:t>Certificate of Incorporation + UMDPC 2026 licence from company-docs/</w:t>
             </w:r>
           </w:p>
         </w:tc>
@@ -1289,7 +1289,7 @@
           <w:color w:val="0A1F2E"/>
           <w:sz w:val="32"/>
         </w:rPr>
-        <w:t>3. Win-win positioning</w:t>
+        <w:t>3. Why this fits</w:t>
       </w:r>
     </w:p>
     <w:p>
@@ -1304,7 +1304,7 @@
           <w:color w:val="1E2F38"/>
           <w:sz w:val="22"/>
         </w:rPr>
-        <w:t>As Uganda expands digital health tools, community and facility data often move without clear consent, inclusion for offline users, or a simple way for people to challenge mistakes. Trust then lags behind technology — and exclusion grows.</w:t>
+        <w:t>Community and clinic health data are going digital in Kampala, but consent, offline access, and a simple way to challenge mistakes are still thin — so trust can fail just as the tools scale.</w:t>
       </w:r>
     </w:p>
     <w:p>
@@ -1319,7 +1319,7 @@
           <w:color w:val="1E2F38"/>
           <w:sz w:val="22"/>
         </w:rPr>
-        <w:t>Embed three live safeguards into FairBanks' FCHIP sectoral digital health DPI: responsible consent and EMR/HMS data sharing; offline-first inclusion; and a community grievance pathway — co-owned with government and civil society.</w:t>
+        <w:t>We will embed consent rules, offline-friendly inclusion, and a community grievance path into FairBanks' live FCHIP health data platform in Kawempe, with KCCA Division health and VHTs at the table.</w:t>
       </w:r>
     </w:p>
     <w:p>
@@ -1334,7 +1334,7 @@
           <w:color w:val="1E2F38"/>
           <w:sz w:val="22"/>
         </w:rPr>
-        <w:t>Government alignment: Work with a named public health authority on an active digital health deployment; prepare for a Stage 2 commitment letter.</w:t>
+        <w:t>Government link: Named counterpart: KCCA / Kawempe Division health. Stage 2 letter is the next step.</w:t>
       </w:r>
     </w:p>
     <w:p>
@@ -1349,7 +1349,7 @@
           <w:color w:val="1E2F38"/>
           <w:sz w:val="22"/>
         </w:rPr>
-        <w:t>Civil society integration: VHTs, households, and community champions co-design, validate, and monitor — not a one-off consultation.</w:t>
+        <w:t>Community role: VHTs, households, CHIS groups, and GeriCare clients help design and test — ongoing.</w:t>
       </w:r>
     </w:p>
     <w:p>
@@ -1364,7 +1364,7 @@
           <w:color w:val="1E2F38"/>
           <w:sz w:val="22"/>
         </w:rPr>
-        <w:t>Tangible outputs: Six operational assets in 9 months, used in live FCHIP workflows and shared as learning for the global Framework.</w:t>
+        <w:t>Clear outputs: Six field assets in nine months, used inside FCHIP and Community Reach.</w:t>
       </w:r>
     </w:p>
     <w:p>
@@ -1379,7 +1379,7 @@
           <w:color w:val="1E2F38"/>
           <w:sz w:val="22"/>
         </w:rPr>
-        <w:t>Framework fit: Maps to Universal DPI Safeguards priorities: inclusion, accountable data use, recourse, multistakeholder governance, and sectoral DPI (digital health).</w:t>
+        <w:t>Honest fit: Licensed clinic, working digital health MVP, peri-urban Kampala catchments.</w:t>
       </w:r>
     </w:p>
     <w:p>
@@ -1452,7 +1452,7 @@
           <w:color w:val="1E2F38"/>
           <w:sz w:val="22"/>
         </w:rPr>
-        <w:t>FairBanks is a community health organisation in Kampala, Uganda. We run a medical centre and FairBanks Community Reach — a six-step cascade linking community members, CHWs and VHTs, outreach programmes, clinical care, research and skills, and economic empowerment including CHIS (community health insurance) and livelihoods. Our active catchments include Bukoto, Kyebando, Kisaasi, Kamwokya, Kikaaya, and surrounding peri-urban communities. FCHIP (FairBanks Community Health Intelligence Platform) is our working MVP digital component on the Data and Feedback loop: offline mobile capture for CHWs/VHTs, multi-source health signals, GIS, climate-aware early warning, facility dashboards, and secure authenticated data APIs so existing EMR/HMS systems can share clinical data into FCHIP in real time without replacing clinic software. Legal entity type and registration evidence: [CONFIRM BEFORE SUBMISSION].</w:t>
+        <w:t>FAIRBANKS MEDICAL CENTRE LIMITED is a Uganda private company limited by shares (Company No. 80020003843337, incorporated 4 October 2022). We run a UMDPC-licensed medical centre and pharmacy on Tirupati Road, Kyebando–Kisalosalo, Kawempe Division, Kampala. Through FairBanks Community Reach we work with community members, Village Health Teams and community health workers, schools and local groups in Bukoto, Kyebando, Kisaasi, Kamwokya, Kikaaya and nearby areas. Care runs from home and community outreach into our medical centre. We also run GeriCare for older people, maternal and child support, chronic-disease screening, and a community health insurance scheme (CHIS) so families can share the cost of care. The digital piece is FCHIP — the FairBanks Community Health Intelligence Platform. It is already a working MVP. Frontline workers can capture household and outreach data on phones even when the network is weak. The platform brings community signals together with facility records and secure data links so existing clinic systems can send approved clinical data into FCHIP without forcing clinics to throw away the software they already use. In this Accelerator we are not selling software. We are putting practical safeguards into that live digital health rollout while it is still young.</w:t>
       </w:r>
     </w:p>
     <w:p>
@@ -1481,7 +1481,7 @@
           <w:color w:val="1E2F38"/>
           <w:sz w:val="22"/>
         </w:rPr>
-        <w:t>The active DPI effort we support is sectoral digital health infrastructure for community-to-facility data exchange in Uganda — not a consumer health app. In practice this is FCHIP as a live deployment layer that connects last-mile CHW/VHT data, school and community outreach signals, FairBanks Medical Centre and partner clinic workflows, and secure EMR/HMS interoperability. This sits alongside Uganda's broader digital health and HMIS/DHIS2 landscape and is designed to strengthen trust, inclusion, and accountable data use as digital health services scale. We treat this as sectoral DPI because it is a shared digital building block for public-interest health services: identity of households for continuity of care (with consent), structured data exchange across actors, and decision support that affects real people. National programme name / MoH digital health alignment wording: [CONFIRM BEFORE SUBMISSION].</w:t>
+        <w:t>The DPI we support is sectoral digital health infrastructure for community-to-facility data exchange in Uganda. In practice that is FCHIP: last-mile VHT and community health worker data, school and outreach signals, FairBanks Medical Centre workflows, and narrow links to existing clinic records systems. Uganda's digital health tools are growing — continuity of care, data exchange, and dashboards that guide outreach. People feel that in their homes and at the clinic desk. Our focus is trust: clear consent, offline access for people with weak networks, and a real way to challenge mistakes before the platform scales.</w:t>
       </w:r>
     </w:p>
     <w:p>
@@ -1510,7 +1510,7 @@
           <w:color w:val="1E2F38"/>
           <w:sz w:val="22"/>
         </w:rPr>
-        <w:t>Intended government counterpart for Stage 1 alignment (must be confirmed): [CONFIRM BEFORE SUBMISSION] (examples to verify — do not submit unconfirmed names: Ministry of Health digital health / community health structures; Kampala Capital City Authority health directorate; or the District Health Office covering FairBanks catchments). We seek a working relationship that can progress to a formal written institutional confirmation for Stage 2 — a commitment letter supporting the safeguards intervention and willingness to participate in the cohort. Current status of endorsement discussions: [CONFIRM BEFORE SUBMISSION].</w:t>
+        <w:t>Our named counterpart is Kampala Capital City Authority (KCCA) — Kawempe Division health structures. Our facility is licensed and operates in Kawempe Division. Community Reach and VHT-linked work sit in the same city health geography. We already engage the public health system as a licensed private provider (UMDPC licence current for 2026) and through frontline VHT relationships. We do not yet have a signed MoU or commitment letter for this Accelerator. If longlisted, Stage 2 requires written support. Getting that letter is our first Stage 2 task, led by Racheal Nabukeera.</w:t>
       </w:r>
     </w:p>
     <w:p>
@@ -1539,7 +1539,7 @@
           <w:color w:val="1E2F38"/>
           <w:sz w:val="22"/>
         </w:rPr>
-        <w:t>Issue-specific safeguards work, with a short system-level risk map to prioritise actions. Over 6–9 months we will advance three concrete safeguards inside the live FCHIP / community health DPI deployment: (1) responsible data use, consent, and least-privilege EMR/HMS data sharing; (2) offline-first inclusion for underserved peri-urban users and frontline workers with limited connectivity or literacy; (3) a practical grievance and recourse pathway for people affected by digital health data use or alerts. The short system-level map will use the Universal DPI Safeguards Framework to show gaps, owners, and sequence — then we execute the three measures.</w:t>
+        <w:t>Issue-specific safeguards work. Over nine months we will put three concrete safeguards into the live FCHIP deployment: (1) consent and responsible data sharing — clear household consent, purpose limits, least-privilege access for any facility data link, and a simple audit trail; (2) offline and inclusion — tools that work without steady internet, design for low literacy, and reach to women, older people, people with disabilities, and poorer urban households; (3) grievance and recourse — a named route to ask about data, request a correction, or raise a concern about an alert, with someone responsible and a response time. We start with a short risk map of the FCHIP data path so the three measures sit in the right order.</w:t>
       </w:r>
     </w:p>
     <w:p>
@@ -1568,7 +1568,7 @@
           <w:color w:val="1E2F38"/>
           <w:sz w:val="22"/>
         </w:rPr>
-        <w:t>FCHIP already has a working MVP and is moving from build toward field validation inside FairBanks Community Reach. This is the moment when safeguards must be woven into live workflows — consent, API scopes, offline inclusion, and recourse — before habits harden and before EMR/HMS feeds, GIS alerts, and climate-linked early warnings scale. The Universal DPI Safeguards Framework and Accelerator emphasise that 2026–2028 is a crucial window to embed operational safeguards into code, design, governance, and oversight as DPI moves from pilots to population use. Digital health is exactly the kind of sectoral DPI use case the Framework anticipates. Acting now lets Uganda produce a practical, community-rooted safeguards package others can learn from, instead of retrofitting trust after exclusion or privacy harms appear.</w:t>
+        <w:t>FCHIP is past the blank-page stage. The MVP works. We are moving into real use with VHTs and our facility team. That is when bad habits stick — weak consent, open data pipes, no way for a mother in Kyebando to challenge a wrong record. If we wait until the platform is finished, fixing trust later will be harder. Putting safeguards in now means consent, access rules, offline access, and a complaint path ship with the same workflows we are validating in Bukoto, Kyebando, Kisaasi, Kamwokya and Kikaaya. Uganda needs examples grounded in a real clinic and real communities, not only frameworks on paper.</w:t>
       </w:r>
     </w:p>
     <w:p>
@@ -1597,7 +1597,7 @@
           <w:color w:val="1E2F38"/>
           <w:sz w:val="22"/>
         </w:rPr>
-        <w:t>Within the 6–9 month Accelerator cycle we commit to these operational assets: (1) a safeguards risk-and-gap brief for the FCHIP community health data exchange, mapped to Universal DPI Safeguards Framework principles and practices; (2) an operational consent and data-sharing protocol for CHW/VHT capture and secure EMR/HMS APIs (authentication, purpose limitation, least privilege, audit); (3) an inclusion playbook for offline access, low-literacy UX, and reach to women, older people, persons with disabilities, and urban poor households in our catchments; (4) a community grievance / user recourse pathway for data access requests, correction, and alert-related concerns, with named owners and response times; (5) a standing multistakeholder safeguards working group (FairBanks, VHTs/CHWs, facility clinical lead, government liaison, and community champions) with meeting records; (6) a short public learning note suitable for the DPI Safeguards Resource Hub. Success means these assets are used in live workflows — not only written.</w:t>
+        <w:t>By the end of nine months we will deliver and use: (1) a short safeguards risk-and-gap note for the FCHIP community–facility data path; (2) a consent and data-sharing protocol used in VHT capture and any facility records link; (3) an inclusion checklist and field playbook for offline use and underserved groups; (4) a live grievance pathway with named owners, contact channel, and response times, tested with community members; (5) a small working group that meets monthly — FairBanks clinical and Community Reach leads, VHT representatives, a facility contact, and a KCCA/Kawempe liaison once confirmed — with simple meeting notes; (6) a two-to-four page learning note for the DPI Safeguards Resource Hub. We will judge success by use in the field, not by documents sitting in a folder.</w:t>
       </w:r>
     </w:p>
     <w:p>
@@ -1626,7 +1626,7 @@
           <w:color w:val="1E2F38"/>
           <w:sz w:val="22"/>
         </w:rPr>
-        <w:t>FairBanks team: product/clinical/data-protection leads implement protocols inside FCHIP and facility workflows; Community Reach coordinators convene field testing. Government counterpart: validates priorities, aligns with national digital health and community health guidance, and participates in the working group ([CONFIRM BEFORE SUBMISSION] named focal point). Civil society and affected users: VHTs/CHWs, community members from Bukoto, Kyebando, Kisaasi, Kamwokya, and Kikaaya, CHIS/livelihood group representatives, and local CSO champions co-design consent language, inclusion tests, and the grievance pathway — with defined roles in validation and monitoring, not one-off consultations. Private/ecosystem: EMR/HMS and facility IT contacts advise on API scopes without replacing existing systems. Rhythm: kick-off workshop; monthly working-group reviews; community listening sessions each quarter; end-of-cycle demo of live safeguards in the deployment.</w:t>
+        <w:t>FairBanks: Racheal Nabukeera (Managing Director and Co-founder) holds overall accountability. Clinical and Community Reach coordinators run field tests. A technical lead wires consent prompts, access controls, and offline behaviour into FCHIP. A data-protection lead (named in Stage 2) owns the protocol and the grievance log. Government: KCCA / Kawempe Division health focal point reviews priorities, joins the monthly working group when available, and is the path for the Stage 2 support letter. Civil society and affected users: VHTs from our catchments co-write consent wording; community members — including women, older people, and GeriCare clients — help test offline tools and the complaint path; CHIS group representatives speak for families who pool money for care; local champions help check whether the grievance route is reachable. This is ongoing work, not a one-day workshop. Rhythm: kick-off in month 1; monthly working-group check-ins; community listening each quarter; end-of-cycle walkthrough of the three safeguards in live use.</w:t>
       </w:r>
     </w:p>
     <w:p>
@@ -1655,7 +1655,7 @@
           <w:color w:val="1E2F38"/>
           <w:sz w:val="22"/>
         </w:rPr>
-        <w:t>Indicative request: USD 70,000 catalytic grant over 9 months. This accelerates safeguards mobilisation inside an existing deployment; it does not replace FairBanks' ongoing Community Reach or clinical financing. Approximate allocation (refine in Stage 2): personnel and community stipends for co-design and safeguards facilitation (~40%); technical work to operationalise consent, API controls, offline inclusion, and grievance tooling in the MVP (~30%); workshops, travel within Kampala catchments, translation/printing (~15%); MEL, documentation, and learning products for the Resource Hub (~15%). Co-funding / in-kind: [CONFIRM BEFORE SUBMISSION].</w:t>
+        <w:t>Duration: 9 months. Request: USD 70,000. Rough split: staff time, VHT and community stipends, and safeguards facilitation USD 28,000; technical work on consent flows, access controls, offline UX, and grievance tooling USD 21,000; workshops, local Kampala travel, translation and printing USD 10,500; monitoring, documentation, learning note and cohort participation USD 10,500. This speeds up safeguards inside work we already run. It does not replace clinic income or Community Reach operating costs.</w:t>
       </w:r>
     </w:p>
     <w:p>
@@ -1734,7 +1734,7 @@
                 <w:color w:val="1E2F38"/>
                 <w:sz w:val="20"/>
               </w:rPr>
-              <w:t>Safeguards lead, clinical/data-protection time, VHT/CHW stipends</w:t>
+              <w:t>Staff time, VHT/community stipends, safeguards facilitation</w:t>
             </w:r>
           </w:p>
         </w:tc>
@@ -1771,7 +1771,7 @@
                 <w:color w:val="1E2F38"/>
                 <w:sz w:val="20"/>
               </w:rPr>
-              <w:t>Technical implementation (consent flows, API scopes, offline UX, grievance tooling)</w:t>
+              <w:t>Technical work (consent, access controls, offline UX, grievance tooling)</w:t>
             </w:r>
           </w:p>
         </w:tc>
@@ -1808,7 +1808,7 @@
                 <w:color w:val="1E2F38"/>
                 <w:sz w:val="20"/>
               </w:rPr>
-              <w:t>Workshops, community sessions, local travel, translation, materials</w:t>
+              <w:t>Workshops, local travel, translation, printing</w:t>
             </w:r>
           </w:p>
         </w:tc>
@@ -1845,7 +1845,7 @@
                 <w:color w:val="1E2F38"/>
                 <w:sz w:val="20"/>
               </w:rPr>
-              <w:t>MEL, documentation, Resource Hub learning note, cohort participation costs</w:t>
+              <w:t>Monitoring, documentation, learning note, cohort participation</w:t>
             </w:r>
           </w:p>
         </w:tc>
@@ -1882,7 +1882,7 @@
                 <w:color w:val="1E2F38"/>
                 <w:sz w:val="20"/>
               </w:rPr>
-              <w:t>Total catalytic ask</w:t>
+              <w:t>Total</w:t>
             </w:r>
           </w:p>
         </w:tc>
@@ -2193,7 +2193,7 @@
           <w:color w:val="1E2F38"/>
           <w:sz w:val="22"/>
         </w:rPr>
-        <w:t>Granular activity plan by month with owners and milestones</w:t>
+        <w:t>Month-by-month activity plan with owners</w:t>
       </w:r>
     </w:p>
     <w:p>
@@ -2208,7 +2208,7 @@
           <w:color w:val="1E2F38"/>
           <w:sz w:val="22"/>
         </w:rPr>
-        <w:t>Finalised budget with quotations and salary scales</w:t>
+        <w:t>Final budget with quotes and salary scales</w:t>
       </w:r>
     </w:p>
     <w:p>
@@ -2223,7 +2223,7 @@
           <w:color w:val="1E2F38"/>
           <w:sz w:val="22"/>
         </w:rPr>
-        <w:t>Organisational profile + verified proof of legal status (NGO pathway)</w:t>
+        <w:t>Certificate of Incorporation + UMDPC licence as legal proof</w:t>
       </w:r>
     </w:p>
     <w:p>
@@ -2238,7 +2238,7 @@
           <w:color w:val="1E2F38"/>
           <w:sz w:val="22"/>
         </w:rPr>
-        <w:t>Written government support / commitment letter from collaborating authority</w:t>
+        <w:t>Written support letter from KCCA / Kawempe Division health</w:t>
       </w:r>
     </w:p>
     <w:p>
@@ -2253,7 +2253,7 @@
           <w:color w:val="1E2F38"/>
           <w:sz w:val="22"/>
         </w:rPr>
-        <w:t>Named civil society / affected-user roles and meeting cadence</w:t>
+        <w:t>Named VHT and community roles and meeting dates</w:t>
       </w:r>
     </w:p>
     <w:p>
@@ -2268,7 +2268,7 @@
           <w:color w:val="1E2F38"/>
           <w:sz w:val="22"/>
         </w:rPr>
-        <w:t>Data protection, safeguarding, and ethics approach for health data</w:t>
+        <w:t>Simple data-protection and safeguarding note for health data</w:t>
       </w:r>
     </w:p>
     <w:p>
@@ -2283,7 +2283,7 @@
           <w:color w:val="1E2F38"/>
           <w:sz w:val="22"/>
         </w:rPr>
-        <w:t>Risk register and mitigation (privacy, exclusion, alert harm, adoption)</w:t>
+        <w:t>Risks: privacy, exclusion, wrong alerts, weak adoption — and how we handle them</w:t>
       </w:r>
     </w:p>
     <w:p>
@@ -2298,7 +2298,7 @@
           <w:color w:val="1E2F38"/>
           <w:sz w:val="22"/>
         </w:rPr>
-        <w:t>Learning and contribution plan for the DPI Safeguards Resource Hub</w:t>
+        <w:t>Learning note plan for the DPI Safeguards Resource Hub</w:t>
       </w:r>
     </w:p>
     <w:p>
@@ -2342,7 +2342,7 @@
           <w:color w:val="1E2F38"/>
           <w:sz w:val="22"/>
         </w:rPr>
-        <w:t>Confirm NGO-pathway legal eligibility (or eligible lead partner).</w:t>
+        <w:t>Use legal name FAIRBANKS MEDICAL CENTRE LIMITED on the form.</w:t>
       </w:r>
     </w:p>
     <w:p>
@@ -2357,7 +2357,7 @@
           <w:color w:val="1E2F38"/>
           <w:sz w:val="22"/>
         </w:rPr>
-        <w:t>Replace every CONFIRM BEFORE SUBMISSION marker with verified facts.</w:t>
+        <w:t>Paste answers from stage1_airtable_answers.md (match field meaning).</w:t>
       </w:r>
     </w:p>
     <w:p>
@@ -2372,7 +2372,7 @@
           <w:color w:val="1E2F38"/>
           <w:sz w:val="22"/>
         </w:rPr>
-        <w:t>Name the government counterpart you can truthfully claim today.</w:t>
+        <w:t>Open the NGO Airtable form (use a network that allows Airtable if blocked).</w:t>
       </w:r>
     </w:p>
     <w:p>
@@ -2387,7 +2387,7 @@
           <w:color w:val="1E2F38"/>
           <w:sz w:val="22"/>
         </w:rPr>
-        <w:t>Open the NGO Airtable form (use permitted network/VPN if region-blocked).</w:t>
+        <w:t>Save confirmation or screenshot after submit.</w:t>
       </w:r>
     </w:p>
     <w:p>
@@ -2402,37 +2402,7 @@
           <w:color w:val="1E2F38"/>
           <w:sz w:val="22"/>
         </w:rPr>
-        <w:t>Paste Stage 1 answers; keep tone practical and community-rooted.</w:t>
-      </w:r>
-    </w:p>
-    <w:p>
-      <w:pPr>
-        <w:pStyle w:val="ListBullet"/>
-        <w:spacing w:after="80"/>
-      </w:pPr>
-      <w:r>
-        <w:rPr>
-          <w:rFonts w:ascii="Calibri" w:hAnsi="Calibri" w:eastAsia="Calibri"/>
-          <w:b w:val="0"/>
-          <w:color w:val="1E2F38"/>
-          <w:sz w:val="22"/>
-        </w:rPr>
-        <w:t>Save confirmation / screenshot of submission.</w:t>
-      </w:r>
-    </w:p>
-    <w:p>
-      <w:pPr>
-        <w:pStyle w:val="ListBullet"/>
-        <w:spacing w:after="80"/>
-      </w:pPr>
-      <w:r>
-        <w:rPr>
-          <w:rFonts w:ascii="Calibri" w:hAnsi="Calibri" w:eastAsia="Calibri"/>
-          <w:b w:val="0"/>
-          <w:color w:val="1E2F38"/>
-          <w:sz w:val="22"/>
-        </w:rPr>
-        <w:t>Start drafting the government commitment letter request the same day.</w:t>
+        <w:t>Same day: draft the KCCA / Kawempe Division support-letter request.</w:t>
       </w:r>
     </w:p>
     <w:p>

</xml_diff>

<commit_message>
Align DPI Safeguards Stage 1 answers with the public website and URA TIN.
Use fairbanksmedicalcentre.org contacts and FCHIP wording, keep the TIN principal address, and refresh the synced application pack.

Co-authored-by: Cursor <cursoragent@cursor.com>
</commit_message>
<xml_diff>
--- a/applications/dpi-safeguards/documents/dpi-safeguards_word.docx
+++ b/applications/dpi-safeguards/documents/dpi-safeguards_word.docx
@@ -488,7 +488,7 @@
                 <w:color w:val="1E2F38"/>
                 <w:sz w:val="20"/>
               </w:rPr>
-              <w:t>info@fairbanksmedicalcentre.com · +256 772 849 258</w:t>
+              <w:t>info@fairbanksmedicalcentre.org · +256 748 319 052 / +256 777 462 398</w:t>
             </w:r>
           </w:p>
         </w:tc>
@@ -526,7 +526,7 @@
                 <w:color w:val="1E2F38"/>
                 <w:sz w:val="20"/>
               </w:rPr>
-              <w:t>Kampala Capital City Authority (KCCA) — Kawempe Division health structures</w:t>
+              <w:t>Kampala Capital City Authority (KCCA) — Central Division health structures</w:t>
             </w:r>
           </w:p>
         </w:tc>
@@ -562,7 +562,7 @@
                 <w:color w:val="1E2F38"/>
                 <w:sz w:val="20"/>
               </w:rPr>
-              <w:t>Tirupati Road, Kyebando Kisalosalo, Kawempe Division, Kampala</w:t>
+              <w:t>Plot 1423 and 1425 Tirupati Road, Fairbanks Medical Centre, Kampala Central Division, Kololo IV, Lugogo, Kampala</w:t>
             </w:r>
           </w:p>
         </w:tc>
@@ -921,7 +921,7 @@
                 <w:color w:val="1E2F38"/>
                 <w:sz w:val="20"/>
               </w:rPr>
-              <w:t>Kampala Capital City Authority (KCCA) — Kawempe Division health structures</w:t>
+              <w:t>Kampala Capital City Authority (KCCA) — Central Division health structures</w:t>
             </w:r>
           </w:p>
         </w:tc>
@@ -1106,7 +1106,7 @@
                 <w:color w:val="1E2F38"/>
                 <w:sz w:val="20"/>
               </w:rPr>
-              <w:t>Lead contact</w:t>
+              <w:t>TIN</w:t>
             </w:r>
           </w:p>
         </w:tc>
@@ -1124,7 +1124,7 @@
                 <w:color w:val="1E2F38"/>
                 <w:sz w:val="20"/>
               </w:rPr>
-              <w:t>Racheal Nabukeera, Managing Director and Co-founder · info@fairbanksmedicalcentre.com · +256 772 849 258</w:t>
+              <w:t>1053370026</w:t>
             </w:r>
           </w:p>
         </w:tc>
@@ -1143,7 +1143,7 @@
                 <w:color w:val="1E2F38"/>
                 <w:sz w:val="20"/>
               </w:rPr>
-              <w:t>Address</w:t>
+              <w:t>Lead contact</w:t>
             </w:r>
           </w:p>
         </w:tc>
@@ -1160,7 +1160,7 @@
                 <w:color w:val="1E2F38"/>
                 <w:sz w:val="20"/>
               </w:rPr>
-              <w:t>Tirupati Road, Kyebando Kisalosalo, Kawempe Division, Kampala</w:t>
+              <w:t>Racheal Nabukeera, Managing Director and Co-founder · info@fairbanksmedicalcentre.org · +256 748 319 052 / +256 777 462 398</w:t>
             </w:r>
           </w:p>
         </w:tc>
@@ -1180,7 +1180,7 @@
                 <w:color w:val="1E2F38"/>
                 <w:sz w:val="20"/>
               </w:rPr>
-              <w:t>Government counterpart</w:t>
+              <w:t>Website</w:t>
             </w:r>
           </w:p>
         </w:tc>
@@ -1198,7 +1198,7 @@
                 <w:color w:val="1E2F38"/>
                 <w:sz w:val="20"/>
               </w:rPr>
-              <w:t>Kampala Capital City Authority (KCCA) — Kawempe Division health structures</w:t>
+              <w:t>https://www.fairbanksmedicalcentre.org/</w:t>
             </w:r>
           </w:p>
         </w:tc>
@@ -1217,7 +1217,7 @@
                 <w:color w:val="1E2F38"/>
                 <w:sz w:val="20"/>
               </w:rPr>
-              <w:t>Stage 2 letter</w:t>
+              <w:t>Address (URA TIN)</w:t>
             </w:r>
           </w:p>
         </w:tc>
@@ -1234,7 +1234,7 @@
                 <w:color w:val="1E2F38"/>
                 <w:sz w:val="20"/>
               </w:rPr>
-              <w:t>No MoU yet. First Stage 2 task: written support from KCCA / Kawempe Division health.</w:t>
+              <w:t>Plot 1423 and 1425 Tirupati Road, Fairbanks Medical Centre, Kampala Central Division, Kololo IV, Lugogo, Kampala</w:t>
             </w:r>
           </w:p>
         </w:tc>
@@ -1254,7 +1254,7 @@
                 <w:color w:val="1E2F38"/>
                 <w:sz w:val="20"/>
               </w:rPr>
-              <w:t>Stage 2 legal proof</w:t>
+              <w:t>Public location (website)</w:t>
             </w:r>
           </w:p>
         </w:tc>
@@ -1272,7 +1272,117 @@
                 <w:color w:val="1E2F38"/>
                 <w:sz w:val="20"/>
               </w:rPr>
-              <w:t>Certificate of Incorporation + UMDPC 2026 licence from company-docs/</w:t>
+              <w:t>Kyebando–Kisalosalo, Northern Bypass, Kampala</w:t>
+            </w:r>
+          </w:p>
+        </w:tc>
+      </w:tr>
+      <w:tr>
+        <w:tc>
+          <w:tcPr>
+            <w:tcW w:type="dxa" w:w="4968"/>
+          </w:tcPr>
+          <w:p>
+            <w:r/>
+            <w:r>
+              <w:rPr>
+                <w:rFonts w:ascii="Calibri" w:hAnsi="Calibri" w:eastAsia="Calibri"/>
+                <w:b w:val="0"/>
+                <w:color w:val="1E2F38"/>
+                <w:sz w:val="20"/>
+              </w:rPr>
+              <w:t>Government counterpart</w:t>
+            </w:r>
+          </w:p>
+        </w:tc>
+        <w:tc>
+          <w:tcPr>
+            <w:tcW w:type="dxa" w:w="4968"/>
+          </w:tcPr>
+          <w:p>
+            <w:r/>
+            <w:r>
+              <w:rPr>
+                <w:rFonts w:ascii="Calibri" w:hAnsi="Calibri" w:eastAsia="Calibri"/>
+                <w:b w:val="0"/>
+                <w:color w:val="1E2F38"/>
+                <w:sz w:val="20"/>
+              </w:rPr>
+              <w:t>Kampala Capital City Authority (KCCA) — Central Division health structures</w:t>
+            </w:r>
+          </w:p>
+        </w:tc>
+      </w:tr>
+      <w:tr>
+        <w:tc>
+          <w:tcPr>
+            <w:tcW w:type="dxa" w:w="4968"/>
+            <w:shd w:fill="E8F3F2" w:val="clear"/>
+          </w:tcPr>
+          <w:p>
+            <w:r/>
+            <w:r>
+              <w:rPr>
+                <w:rFonts w:ascii="Calibri" w:hAnsi="Calibri" w:eastAsia="Calibri"/>
+                <w:b w:val="0"/>
+                <w:color w:val="1E2F38"/>
+                <w:sz w:val="20"/>
+              </w:rPr>
+              <w:t>Stage 2 letter</w:t>
+            </w:r>
+          </w:p>
+        </w:tc>
+        <w:tc>
+          <w:tcPr>
+            <w:tcW w:type="dxa" w:w="4968"/>
+            <w:shd w:fill="E8F3F2" w:val="clear"/>
+          </w:tcPr>
+          <w:p>
+            <w:r/>
+            <w:r>
+              <w:rPr>
+                <w:rFonts w:ascii="Calibri" w:hAnsi="Calibri" w:eastAsia="Calibri"/>
+                <w:b w:val="0"/>
+                <w:color w:val="1E2F38"/>
+                <w:sz w:val="20"/>
+              </w:rPr>
+              <w:t>No MoU yet. First Stage 2 task: written support from KCCA Central Division health.</w:t>
+            </w:r>
+          </w:p>
+        </w:tc>
+      </w:tr>
+      <w:tr>
+        <w:tc>
+          <w:tcPr>
+            <w:tcW w:type="dxa" w:w="4968"/>
+          </w:tcPr>
+          <w:p>
+            <w:r/>
+            <w:r>
+              <w:rPr>
+                <w:rFonts w:ascii="Calibri" w:hAnsi="Calibri" w:eastAsia="Calibri"/>
+                <w:b w:val="0"/>
+                <w:color w:val="1E2F38"/>
+                <w:sz w:val="20"/>
+              </w:rPr>
+              <w:t>Stage 2 legal proof</w:t>
+            </w:r>
+          </w:p>
+        </w:tc>
+        <w:tc>
+          <w:tcPr>
+            <w:tcW w:type="dxa" w:w="4968"/>
+          </w:tcPr>
+          <w:p>
+            <w:r/>
+            <w:r>
+              <w:rPr>
+                <w:rFonts w:ascii="Calibri" w:hAnsi="Calibri" w:eastAsia="Calibri"/>
+                <w:b w:val="0"/>
+                <w:color w:val="1E2F38"/>
+                <w:sz w:val="20"/>
+              </w:rPr>
+              <w:t>Certificate of Incorporation + URA TIN certificate + UMDPC 2026 licence</w:t>
             </w:r>
           </w:p>
         </w:tc>
@@ -1319,7 +1429,7 @@
           <w:color w:val="1E2F38"/>
           <w:sz w:val="22"/>
         </w:rPr>
-        <w:t>We will embed consent rules, offline-friendly inclusion, and a community grievance path into FairBanks' live FCHIP health data platform in Kawempe, with KCCA Division health and VHTs at the table.</w:t>
+        <w:t>We will embed consent rules, offline-friendly inclusion, and a community grievance path into FairBanks' live FCHIP platform (Capture, Analyse, Alert, Act), with KCCA Central Division health and VHTs at the table.</w:t>
       </w:r>
     </w:p>
     <w:p>
@@ -1334,7 +1444,7 @@
           <w:color w:val="1E2F38"/>
           <w:sz w:val="22"/>
         </w:rPr>
-        <w:t>Government link: Named counterpart: KCCA / Kawempe Division health. Stage 2 letter is the next step.</w:t>
+        <w:t>Government link: Named counterpart: KCCA Central Division health. Stage 2 letter is the next step.</w:t>
       </w:r>
     </w:p>
     <w:p>
@@ -1452,7 +1562,7 @@
           <w:color w:val="1E2F38"/>
           <w:sz w:val="22"/>
         </w:rPr>
-        <w:t>FAIRBANKS MEDICAL CENTRE LIMITED is a Uganda private company limited by shares (Company No. 80020003843337, incorporated 4 October 2022). We run a UMDPC-licensed medical centre and pharmacy on Tirupati Road, Kyebando–Kisalosalo, Kawempe Division, Kampala. Through FairBanks Community Reach we work with community members, Village Health Teams and community health workers, schools and local groups in Bukoto, Kyebando, Kisaasi, Kamwokya, Kikaaya and nearby areas. Care runs from home and community outreach into our medical centre. We also run GeriCare for older people, maternal and child support, chronic-disease screening, and a community health insurance scheme (CHIS) so families can share the cost of care. The digital piece is FCHIP — the FairBanks Community Health Intelligence Platform. It is already a working MVP. Frontline workers can capture household and outreach data on phones even when the network is weak. The platform brings community signals together with facility records and secure data links so existing clinic systems can send approved clinical data into FCHIP without forcing clinics to throw away the software they already use. In this Accelerator we are not selling software. We are putting practical safeguards into that live digital health rollout while it is still young.</w:t>
+        <w:t>FAIRBANKS MEDICAL CENTRE LIMITED (TIN 1053370026) is a Uganda private company limited by shares (Company No. 80020003843337, incorporated 4 October 2022). Our principal place of business on the URA TIN certificate is Plot 1423 and 1425 Tirupati Road, Fairbanks Medical Centre, Kampala Central Division, Kololo IV, Lugogo, Kampala. Our public website (https://www.fairbanksmedicalcentre.org/) lists the community location as Kyebando–Kisalosalo, Northern Bypass, Kampala. Slogan: Your health, our mission. Contact: info@fairbanksmedicalcentre.org, +256 748 319 052 / +256 777 462 398. We run a UMDPC-licensed medical centre and pharmacy with outpatient and inpatient care, 24/7 emergency, diagnostics, paediatrics, obstetrics and gynaecology, retail pharmacy, and vaccination programmes. Through FairBanks Community Reach and GeriCare we work with VHTs, community health workers, schools and local groups in Bukoto, Kyebando, Kisaasi, Kamwokya, Kikaaya and nearby Kampala communities, plus CHIS. FCHIP is our working MVP Data &amp; Feedback layer (Capture → Analyse → Alert → Act): offline CHW/VHT forms, secure facility system links, GIS and climate signals, dashboards and follow-up — with privacy and consent in mind. In this Accelerator we put practical safeguards into that live rollout.</w:t>
       </w:r>
     </w:p>
     <w:p>
@@ -1510,7 +1620,7 @@
           <w:color w:val="1E2F38"/>
           <w:sz w:val="22"/>
         </w:rPr>
-        <w:t>Our named counterpart is Kampala Capital City Authority (KCCA) — Kawempe Division health structures. Our facility is licensed and operates in Kawempe Division. Community Reach and VHT-linked work sit in the same city health geography. We already engage the public health system as a licensed private provider (UMDPC licence current for 2026) and through frontline VHT relationships. We do not yet have a signed MoU or commitment letter for this Accelerator. If longlisted, Stage 2 requires written support. Getting that letter is our first Stage 2 task, led by Racheal Nabukeera.</w:t>
+        <w:t>Our named counterpart is Kampala Capital City Authority (KCCA) — Central Division health structures. Our facility’s registered principal place of business is in Kampala Central Division (Kololo IV, Lugogo) per the URA TIN certificate. We operate as a UMDPC-licensed private health unit in Kampala and work with VHTs linked to city community health practice. We do not yet have a signed MoU or Accelerator commitment letter. If longlisted, Stage 2 requires written institutional support. Getting that letter from KCCA Central Division health leadership is our first Stage 2 task, led by Racheal Nabukeera.</w:t>
       </w:r>
     </w:p>
     <w:p>
@@ -1597,7 +1707,7 @@
           <w:color w:val="1E2F38"/>
           <w:sz w:val="22"/>
         </w:rPr>
-        <w:t>By the end of nine months we will deliver and use: (1) a short safeguards risk-and-gap note for the FCHIP community–facility data path; (2) a consent and data-sharing protocol used in VHT capture and any facility records link; (3) an inclusion checklist and field playbook for offline use and underserved groups; (4) a live grievance pathway with named owners, contact channel, and response times, tested with community members; (5) a small working group that meets monthly — FairBanks clinical and Community Reach leads, VHT representatives, a facility contact, and a KCCA/Kawempe liaison once confirmed — with simple meeting notes; (6) a two-to-four page learning note for the DPI Safeguards Resource Hub. We will judge success by use in the field, not by documents sitting in a folder.</w:t>
+        <w:t>By the end of nine months we will deliver and use: (1) a short safeguards risk-and-gap note for the FCHIP community–facility data path; (2) a consent and data-sharing protocol used in VHT capture and any facility records link; (3) an inclusion checklist and field playbook for offline use and underserved groups; (4) a live grievance pathway with named owners, contact channel, and response times, tested with community members; (5) a small working group that meets monthly — FairBanks clinical and Community Reach leads, VHT representatives, a facility contact, and a KCCA Central Division liaison once confirmed — with simple meeting notes; (6) a two-to-four page learning note for the DPI Safeguards Resource Hub. We will judge success by use in the field, not by documents sitting in a folder.</w:t>
       </w:r>
     </w:p>
     <w:p>
@@ -1626,7 +1736,7 @@
           <w:color w:val="1E2F38"/>
           <w:sz w:val="22"/>
         </w:rPr>
-        <w:t>FairBanks: Racheal Nabukeera (Managing Director and Co-founder) holds overall accountability. Clinical and Community Reach coordinators run field tests. A technical lead wires consent prompts, access controls, and offline behaviour into FCHIP. A data-protection lead (named in Stage 2) owns the protocol and the grievance log. Government: KCCA / Kawempe Division health focal point reviews priorities, joins the monthly working group when available, and is the path for the Stage 2 support letter. Civil society and affected users: VHTs from our catchments co-write consent wording; community members — including women, older people, and GeriCare clients — help test offline tools and the complaint path; CHIS group representatives speak for families who pool money for care; local champions help check whether the grievance route is reachable. This is ongoing work, not a one-day workshop. Rhythm: kick-off in month 1; monthly working-group check-ins; community listening each quarter; end-of-cycle walkthrough of the three safeguards in live use.</w:t>
+        <w:t>FairBanks: Racheal Nabukeera (Managing Director and Co-founder) holds overall accountability. Clinical and Community Reach coordinators run field tests. A technical lead wires consent prompts, access controls, and offline behaviour into FCHIP. A data-protection lead (named in Stage 2) owns the protocol and the grievance log. Government: KCCA Central Division health focal point reviews priorities, joins the monthly working group when available, and is the path for the Stage 2 support letter. Civil society and affected users: VHTs from our catchments co-write consent wording; community members — including women, older people, and GeriCare clients — help test offline tools and the complaint path; CHIS group representatives speak for families who pool money for care; local champions help check whether the grievance route is reachable. This is ongoing work, not a one-day workshop. Rhythm: kick-off in month 1; monthly working-group check-ins; community listening each quarter; end-of-cycle walkthrough of the three safeguards in live use.</w:t>
       </w:r>
     </w:p>
     <w:p>
@@ -2238,7 +2348,7 @@
           <w:color w:val="1E2F38"/>
           <w:sz w:val="22"/>
         </w:rPr>
-        <w:t>Written support letter from KCCA / Kawempe Division health</w:t>
+        <w:t>Written support letter from KCCA Central Division health</w:t>
       </w:r>
     </w:p>
     <w:p>
@@ -2402,7 +2512,7 @@
           <w:color w:val="1E2F38"/>
           <w:sz w:val="22"/>
         </w:rPr>
-        <w:t>Same day: draft the KCCA / Kawempe Division support-letter request.</w:t>
+        <w:t>Same day: draft the KCCA Central Division support-letter request.</w:t>
       </w:r>
     </w:p>
     <w:p>

</xml_diff>